<commit_message>
Hogar de Refugio: indice y documentos con las 42 laminas DPL que imprime la usuaria (DPL-37 a DPL-42 renumeradas, OC-01 incluida)
Co-Authored-By: Claude Opus 5.5 <noreply@anthropic.com>
Claude-Session: https://claude.ai/code/session_0142t8T16igb3VKxUPwnQPq6
</commit_message>
<xml_diff>
--- a/entregables/MEMORIA_DESCRIPTIVA_DRENAJE_PLUVIAL_HOGAR_REFUGIO.docx
+++ b/entregables/MEMORIA_DESCRIPTIVA_DRENAJE_PLUVIAL_HOGAR_REFUGIO.docx
@@ -2357,7 +2357,7 @@
           <w:i w:val="0"/>
           <w:sz w:val="22"/>
         </w:rPr>
-        <w:t>Las montantes son de tubería PVC de Ø 4" (443.22 m), fijadas con abrazaderas de F°G° (79 und) y colgadores en los desvíos bajo el alero (99 und); su tramo inferior se aloja en una falsa columna de concreto armado de 0.20 x 0.15 x 1.30 m (52 und), que la protege de golpes. Los detalles por edificación están en las láminas DPL-15 a DPL-23, el montante típico en DPL-32 y DPL-34 y la falsa columna en DPL-38.</w:t>
+        <w:t>Las montantes son de tubería PVC de Ø 4" (443.22 m), fijadas con abrazaderas de F°G° (79 und) y colgadores en los desvíos bajo el alero (99 und); su tramo inferior se aloja en una falsa columna de concreto armado de 0.20 x 0.15 x 1.30 m (52 und), que la protege de golpes. Los detalles por edificación están en las láminas DPL-15 a DPL-23, el montante típico en DPL-32 y DPL-34 y la falsa columna en DPL-39.</w:t>
       </w:r>
     </w:p>
     <w:p>
@@ -2406,7 +2406,7 @@
       <w:r>
         <w:drawing>
           <wp:inline xmlns:a="http://schemas.openxmlformats.org/drawingml/2006/main" xmlns:pic="http://schemas.openxmlformats.org/drawingml/2006/picture">
-            <wp:extent cx="5580000" cy="3941119"/>
+            <wp:extent cx="5580000" cy="3946582"/>
             <wp:docPr id="3" name="Picture 3"/>
             <wp:cNvGraphicFramePr>
               <a:graphicFrameLocks noChangeAspect="1"/>
@@ -2415,7 +2415,7 @@
               <a:graphicData uri="http://schemas.openxmlformats.org/drawingml/2006/picture">
                 <pic:pic>
                   <pic:nvPicPr>
-                    <pic:cNvPr id="0" name="DPL-41.png"/>
+                    <pic:cNvPr id="0" name="DPL-41.jpg"/>
                     <pic:cNvPicPr/>
                   </pic:nvPicPr>
                   <pic:blipFill>
@@ -2427,7 +2427,7 @@
                   <pic:spPr>
                     <a:xfrm>
                       <a:off x="0" y="0"/>
-                      <a:ext cx="5580000" cy="3941119"/>
+                      <a:ext cx="5580000" cy="3946582"/>
                     </a:xfrm>
                     <a:prstGeom prst="rect"/>
                   </pic:spPr>
@@ -3724,7 +3724,7 @@
           <w:i w:val="0"/>
           <w:sz w:val="22"/>
         </w:rPr>
-        <w:t>En los tramos en que el muro de la cuneta colinda con un área verde se colocan lloraderos de tubería PVC de Ø 3" cada 1.50 m, con filtro de grava envuelto en geotextil en su boca interior, para aliviar el empuje del agua infiltrada en el jardín sin arrastrar finos: 157 lloraderos en 226.21 m de muro (lámina DPL-39 de ubicación, DPL-37 de detalle y DPL-36 de instalación).</w:t>
+        <w:t>En los tramos en que el muro de la cuneta colinda con un área verde se colocan lloraderos de tubería PVC de Ø 3" cada 1.50 m, con filtro de grava envuelto en geotextil en su boca interior, para aliviar el empuje del agua infiltrada en el jardín sin arrastrar finos: 157 lloraderos en 226.21 m de muro (lámina DPL-40 de ubicación, DPL-38 de detalle y DPL-37 de instalación).</w:t>
       </w:r>
     </w:p>
     <w:p>
@@ -5229,7 +5229,7 @@
           <w:i w:val="0"/>
           <w:sz w:val="20"/>
         </w:rPr>
-        <w:t>Figura N.° 03: Planta de ubicación de lloraderos en cunetas colindantes con área verde (lámina DPL-39)</w:t>
+        <w:t>Figura N.° 03: Planta de ubicación de lloraderos en cunetas colindantes con área verde (lámina DPL-40)</w:t>
       </w:r>
     </w:p>
     <w:p>
@@ -5250,7 +5250,7 @@
               <a:graphicData uri="http://schemas.openxmlformats.org/drawingml/2006/picture">
                 <pic:pic>
                   <pic:nvPicPr>
-                    <pic:cNvPr id="0" name="DPL-39.jpg"/>
+                    <pic:cNvPr id="0" name="DPL-40.jpg"/>
                     <pic:cNvPicPr/>
                   </pic:nvPicPr>
                   <pic:blipFill>
@@ -5285,7 +5285,7 @@
           <w:color w:val="595959"/>
           <w:sz w:val="18"/>
         </w:rPr>
-        <w:t>Fuente: Lámina DPL-39 del expediente de drenaje pluvial.</w:t>
+        <w:t>Fuente: Lámina DPL-40 del expediente de drenaje pluvial.</w:t>
       </w:r>
     </w:p>
     <w:p>
@@ -14725,7 +14725,7 @@
                 <w:i w:val="0"/>
                 <w:sz w:val="17"/>
               </w:rPr>
-              <w:t>DPL-06</w:t>
+              <w:t>DPL-03</w:t>
             </w:r>
           </w:p>
         </w:tc>
@@ -14745,7 +14745,7 @@
                 <w:i w:val="0"/>
                 <w:sz w:val="17"/>
               </w:rPr>
-              <w:t>RED GENERAL COLECTOR PLUVIAL</w:t>
+              <w:t>SECCIONES TRANSVERSALES 01</w:t>
             </w:r>
           </w:p>
         </w:tc>
@@ -14765,7 +14765,7 @@
                 <w:i w:val="0"/>
                 <w:sz w:val="17"/>
               </w:rPr>
-              <w:t>A0</w:t>
+              <w:t>A2</w:t>
             </w:r>
           </w:p>
         </w:tc>
@@ -14807,7 +14807,7 @@
                 <w:i w:val="0"/>
                 <w:sz w:val="17"/>
               </w:rPr>
-              <w:t>DPL-39</w:t>
+              <w:t>DPL-04</w:t>
             </w:r>
           </w:p>
         </w:tc>
@@ -14827,7 +14827,7 @@
                 <w:i w:val="0"/>
                 <w:sz w:val="17"/>
               </w:rPr>
-              <w:t>PLANTA DE UBICACIÓN DE LLORADEROS EN CUNETAS COLINDANTES CON ÁREA VERDE</w:t>
+              <w:t>SECCIONES TRANSVERSALES 02</w:t>
             </w:r>
           </w:p>
         </w:tc>
@@ -14847,7 +14847,7 @@
                 <w:i w:val="0"/>
                 <w:sz w:val="17"/>
               </w:rPr>
-              <w:t>A0</w:t>
+              <w:t>A2</w:t>
             </w:r>
           </w:p>
         </w:tc>
@@ -14889,7 +14889,7 @@
                 <w:i w:val="0"/>
                 <w:sz w:val="17"/>
               </w:rPr>
-              <w:t>DPL-07</w:t>
+              <w:t>DPL-05</w:t>
             </w:r>
           </w:p>
         </w:tc>
@@ -14909,7 +14909,7 @@
                 <w:i w:val="0"/>
                 <w:sz w:val="17"/>
               </w:rPr>
-              <w:t>PERFIL LONGITUDINAL GENERAL DEL COLECTOR</w:t>
+              <w:t>SECCIONES TRANSVERSALES 03</w:t>
             </w:r>
           </w:p>
         </w:tc>
@@ -14929,7 +14929,7 @@
                 <w:i w:val="0"/>
                 <w:sz w:val="17"/>
               </w:rPr>
-              <w:t>A1</w:t>
+              <w:t>A2</w:t>
             </w:r>
           </w:p>
         </w:tc>
@@ -14971,7 +14971,7 @@
                 <w:i w:val="0"/>
                 <w:sz w:val="17"/>
               </w:rPr>
-              <w:t>DPL-18</w:t>
+              <w:t>DPL-06</w:t>
             </w:r>
           </w:p>
         </w:tc>
@@ -14991,7 +14991,7 @@
                 <w:i w:val="0"/>
                 <w:sz w:val="17"/>
               </w:rPr>
-              <w:t>DETALLE MONTANTE - EDIF04</w:t>
+              <w:t>RED GENERAL COLECTOR PLUVIAL</w:t>
             </w:r>
           </w:p>
         </w:tc>
@@ -15011,7 +15011,7 @@
                 <w:i w:val="0"/>
                 <w:sz w:val="17"/>
               </w:rPr>
-              <w:t>A1</w:t>
+              <w:t>A0</w:t>
             </w:r>
           </w:p>
         </w:tc>
@@ -15053,7 +15053,7 @@
                 <w:i w:val="0"/>
                 <w:sz w:val="17"/>
               </w:rPr>
-              <w:t>DPL-19</w:t>
+              <w:t>DPL-07</w:t>
             </w:r>
           </w:p>
         </w:tc>
@@ -15073,7 +15073,7 @@
                 <w:i w:val="0"/>
                 <w:sz w:val="17"/>
               </w:rPr>
-              <w:t>DETALLE MONTANTE - EDIF05</w:t>
+              <w:t>PERFIL LONGITUDINAL GENERAL DEL COLECTOR</w:t>
             </w:r>
           </w:p>
         </w:tc>
@@ -15135,7 +15135,7 @@
                 <w:i w:val="0"/>
                 <w:sz w:val="17"/>
               </w:rPr>
-              <w:t>DPL-21</w:t>
+              <w:t>DPL-08</w:t>
             </w:r>
           </w:p>
         </w:tc>
@@ -15155,7 +15155,7 @@
                 <w:i w:val="0"/>
                 <w:sz w:val="17"/>
               </w:rPr>
-              <w:t>DETALLE MONTANTE - EDIF07</w:t>
+              <w:t>PERFIL LONGITUDINAL DETALLADO DEL COLECTOR</w:t>
             </w:r>
           </w:p>
         </w:tc>
@@ -15175,7 +15175,7 @@
                 <w:i w:val="0"/>
                 <w:sz w:val="17"/>
               </w:rPr>
-              <w:t>A1</w:t>
+              <w:t>A2</w:t>
             </w:r>
           </w:p>
         </w:tc>
@@ -15217,7 +15217,7 @@
                 <w:i w:val="0"/>
                 <w:sz w:val="17"/>
               </w:rPr>
-              <w:t>DPL-24</w:t>
+              <w:t>DPL-09</w:t>
             </w:r>
           </w:p>
         </w:tc>
@@ -15237,7 +15237,7 @@
                 <w:i w:val="0"/>
                 <w:sz w:val="17"/>
               </w:rPr>
-              <w:t>DETALLE DE REGISTRO DE LIMPIEZA - TAPA CIEGA DE CONCRETO ARMADO 0.68x0.68x0.08</w:t>
+              <w:t>PERFIL LONGITUDINAL DETALLADO DEL COLECTOR</w:t>
             </w:r>
           </w:p>
         </w:tc>
@@ -15257,7 +15257,7 @@
                 <w:i w:val="0"/>
                 <w:sz w:val="17"/>
               </w:rPr>
-              <w:t>A1</w:t>
+              <w:t>A2</w:t>
             </w:r>
           </w:p>
         </w:tc>
@@ -15299,7 +15299,7 @@
                 <w:i w:val="0"/>
                 <w:sz w:val="17"/>
               </w:rPr>
-              <w:t>DPL-26</w:t>
+              <w:t>DPL-10</w:t>
             </w:r>
           </w:p>
         </w:tc>
@@ -15319,7 +15319,7 @@
                 <w:i w:val="0"/>
                 <w:sz w:val="17"/>
               </w:rPr>
-              <w:t>CAJA DE LLEGADA (0+000) Y CAJA DE CAÍDA CON POZA DE DISIPACIÓN (ENTREGA AL CAR MUJERES)</w:t>
+              <w:t>SECCIONES TRANSVERSALES DEL COLECTOR</w:t>
             </w:r>
           </w:p>
         </w:tc>
@@ -15339,7 +15339,7 @@
                 <w:i w:val="0"/>
                 <w:sz w:val="17"/>
               </w:rPr>
-              <w:t>A1</w:t>
+              <w:t>A2</w:t>
             </w:r>
           </w:p>
         </w:tc>
@@ -15381,7 +15381,7 @@
                 <w:i w:val="0"/>
                 <w:sz w:val="17"/>
               </w:rPr>
-              <w:t>DPL-36</w:t>
+              <w:t>DPL-11</w:t>
             </w:r>
           </w:p>
         </w:tc>
@@ -15401,7 +15401,7 @@
                 <w:i w:val="0"/>
                 <w:sz w:val="17"/>
               </w:rPr>
-              <w:t>ISOMÉTRICO DE INSTALACIÓN DE LLORADEROS EN CUNETAS</w:t>
+              <w:t>SECCIONES TRANSVERSALES DEL COLECTOR</w:t>
             </w:r>
           </w:p>
         </w:tc>
@@ -15421,7 +15421,7 @@
                 <w:i w:val="0"/>
                 <w:sz w:val="17"/>
               </w:rPr>
-              <w:t>A1</w:t>
+              <w:t>A2</w:t>
             </w:r>
           </w:p>
         </w:tc>
@@ -15463,7 +15463,7 @@
                 <w:i w:val="0"/>
                 <w:sz w:val="17"/>
               </w:rPr>
-              <w:t>DPL-03</w:t>
+              <w:t>DPL-12</w:t>
             </w:r>
           </w:p>
         </w:tc>
@@ -15483,7 +15483,7 @@
                 <w:i w:val="0"/>
                 <w:sz w:val="17"/>
               </w:rPr>
-              <w:t>SECCIONES TRANSVERSALES 01</w:t>
+              <w:t>ISOMÉTRICOS DE LAS SECCIONES TRANSVERSALES</w:t>
             </w:r>
           </w:p>
         </w:tc>
@@ -15545,7 +15545,7 @@
                 <w:i w:val="0"/>
                 <w:sz w:val="17"/>
               </w:rPr>
-              <w:t>DPL-04</w:t>
+              <w:t>DPL-13</w:t>
             </w:r>
           </w:p>
         </w:tc>
@@ -15565,7 +15565,7 @@
                 <w:i w:val="0"/>
                 <w:sz w:val="17"/>
               </w:rPr>
-              <w:t>SECCIONES TRANSVERSALES 02</w:t>
+              <w:t>ISOMÉTRICOS DE LAS SECCIONES TRANSVERSALES</w:t>
             </w:r>
           </w:p>
         </w:tc>
@@ -15627,7 +15627,7 @@
                 <w:i w:val="0"/>
                 <w:sz w:val="17"/>
               </w:rPr>
-              <w:t>DPL-05</w:t>
+              <w:t>DPL-14</w:t>
             </w:r>
           </w:p>
         </w:tc>
@@ -15647,7 +15647,7 @@
                 <w:i w:val="0"/>
                 <w:sz w:val="17"/>
               </w:rPr>
-              <w:t>SECCIONES TRANSVERSALES 03</w:t>
+              <w:t>ISOMÉTRICOS DE LAS SECCIONES TRANSVERSALES</w:t>
             </w:r>
           </w:p>
         </w:tc>
@@ -15667,7 +15667,7 @@
                 <w:i w:val="0"/>
                 <w:sz w:val="17"/>
               </w:rPr>
-              <w:t>A2</w:t>
+              <w:t>A3</w:t>
             </w:r>
           </w:p>
         </w:tc>
@@ -15709,7 +15709,7 @@
                 <w:i w:val="0"/>
                 <w:sz w:val="17"/>
               </w:rPr>
-              <w:t>DPL-08</w:t>
+              <w:t>DPL-15</w:t>
             </w:r>
           </w:p>
         </w:tc>
@@ -15729,7 +15729,7 @@
                 <w:i w:val="0"/>
                 <w:sz w:val="17"/>
               </w:rPr>
-              <w:t>PERFIL LONGITUDINAL DETALLADO DEL COLECTOR</w:t>
+              <w:t>DETALLE MONTANTE - EDIF01</w:t>
             </w:r>
           </w:p>
         </w:tc>
@@ -15791,7 +15791,7 @@
                 <w:i w:val="0"/>
                 <w:sz w:val="17"/>
               </w:rPr>
-              <w:t>DPL-09</w:t>
+              <w:t>DPL-16</w:t>
             </w:r>
           </w:p>
         </w:tc>
@@ -15811,7 +15811,7 @@
                 <w:i w:val="0"/>
                 <w:sz w:val="17"/>
               </w:rPr>
-              <w:t>PERFIL LONGITUDINAL DETALLADO DEL COLECTOR</w:t>
+              <w:t>DETALLE MONTANTE - EDIF02</w:t>
             </w:r>
           </w:p>
         </w:tc>
@@ -15873,7 +15873,7 @@
                 <w:i w:val="0"/>
                 <w:sz w:val="17"/>
               </w:rPr>
-              <w:t>DPL-10</w:t>
+              <w:t>DPL-17</w:t>
             </w:r>
           </w:p>
         </w:tc>
@@ -15893,7 +15893,7 @@
                 <w:i w:val="0"/>
                 <w:sz w:val="17"/>
               </w:rPr>
-              <w:t>SECCIONES TRANSVERSALES DEL COLECTOR</w:t>
+              <w:t>DETALLE MONTANTE - EDIF03</w:t>
             </w:r>
           </w:p>
         </w:tc>
@@ -15955,7 +15955,7 @@
                 <w:i w:val="0"/>
                 <w:sz w:val="17"/>
               </w:rPr>
-              <w:t>DPL-11</w:t>
+              <w:t>DPL-18</w:t>
             </w:r>
           </w:p>
         </w:tc>
@@ -15975,7 +15975,7 @@
                 <w:i w:val="0"/>
                 <w:sz w:val="17"/>
               </w:rPr>
-              <w:t>SECCIONES TRANSVERSALES DEL COLECTOR</w:t>
+              <w:t>DETALLE MONTANTE - EDIF04</w:t>
             </w:r>
           </w:p>
         </w:tc>
@@ -15995,7 +15995,7 @@
                 <w:i w:val="0"/>
                 <w:sz w:val="17"/>
               </w:rPr>
-              <w:t>A2</w:t>
+              <w:t>A1</w:t>
             </w:r>
           </w:p>
         </w:tc>
@@ -16037,7 +16037,7 @@
                 <w:i w:val="0"/>
                 <w:sz w:val="17"/>
               </w:rPr>
-              <w:t>DPL-12</w:t>
+              <w:t>DPL-19</w:t>
             </w:r>
           </w:p>
         </w:tc>
@@ -16057,7 +16057,7 @@
                 <w:i w:val="0"/>
                 <w:sz w:val="17"/>
               </w:rPr>
-              <w:t>ISOMÉTRICOS DE LAS SECCIONES TRANSVERSALES</w:t>
+              <w:t>DETALLE MONTANTE - EDIF05</w:t>
             </w:r>
           </w:p>
         </w:tc>
@@ -16077,7 +16077,7 @@
                 <w:i w:val="0"/>
                 <w:sz w:val="17"/>
               </w:rPr>
-              <w:t>A2</w:t>
+              <w:t>A1</w:t>
             </w:r>
           </w:p>
         </w:tc>
@@ -16119,7 +16119,7 @@
                 <w:i w:val="0"/>
                 <w:sz w:val="17"/>
               </w:rPr>
-              <w:t>DPL-13</w:t>
+              <w:t>DPL-20</w:t>
             </w:r>
           </w:p>
         </w:tc>
@@ -16139,7 +16139,7 @@
                 <w:i w:val="0"/>
                 <w:sz w:val="17"/>
               </w:rPr>
-              <w:t>ISOMÉTRICOS DE LAS SECCIONES TRANSVERSALES</w:t>
+              <w:t>DETALLE MONTANTE - EDIF06</w:t>
             </w:r>
           </w:p>
         </w:tc>
@@ -16201,7 +16201,7 @@
                 <w:i w:val="0"/>
                 <w:sz w:val="17"/>
               </w:rPr>
-              <w:t>DPL-15</w:t>
+              <w:t>DPL-21</w:t>
             </w:r>
           </w:p>
         </w:tc>
@@ -16221,7 +16221,7 @@
                 <w:i w:val="0"/>
                 <w:sz w:val="17"/>
               </w:rPr>
-              <w:t>DETALLE MONTANTE - EDIF01</w:t>
+              <w:t>DETALLE MONTANTE - EDIF07</w:t>
             </w:r>
           </w:p>
         </w:tc>
@@ -16241,7 +16241,7 @@
                 <w:i w:val="0"/>
                 <w:sz w:val="17"/>
               </w:rPr>
-              <w:t>A2</w:t>
+              <w:t>A1</w:t>
             </w:r>
           </w:p>
         </w:tc>
@@ -16283,7 +16283,7 @@
                 <w:i w:val="0"/>
                 <w:sz w:val="17"/>
               </w:rPr>
-              <w:t>DPL-16</w:t>
+              <w:t>DPL-22</w:t>
             </w:r>
           </w:p>
         </w:tc>
@@ -16303,7 +16303,7 @@
                 <w:i w:val="0"/>
                 <w:sz w:val="17"/>
               </w:rPr>
-              <w:t>DETALLE MONTANTE - EDIF02</w:t>
+              <w:t>DETALLE MONTANTE - EDIF08</w:t>
             </w:r>
           </w:p>
         </w:tc>
@@ -16365,7 +16365,7 @@
                 <w:i w:val="0"/>
                 <w:sz w:val="17"/>
               </w:rPr>
-              <w:t>DPL-17</w:t>
+              <w:t>DPL-23</w:t>
             </w:r>
           </w:p>
         </w:tc>
@@ -16385,7 +16385,7 @@
                 <w:i w:val="0"/>
                 <w:sz w:val="17"/>
               </w:rPr>
-              <w:t>DETALLE MONTANTE - EDIF03</w:t>
+              <w:t>DETALLE MONTANTE - EDIF09</w:t>
             </w:r>
           </w:p>
         </w:tc>
@@ -16447,7 +16447,7 @@
                 <w:i w:val="0"/>
                 <w:sz w:val="17"/>
               </w:rPr>
-              <w:t>DPL-20</w:t>
+              <w:t>DPL-24</w:t>
             </w:r>
           </w:p>
         </w:tc>
@@ -16467,7 +16467,7 @@
                 <w:i w:val="0"/>
                 <w:sz w:val="17"/>
               </w:rPr>
-              <w:t>DETALLE MONTANTE - EDIF06</w:t>
+              <w:t>DETALLE DE REGISTRO DE LIMPIEZA - TAPA CIEGA DE CONCRETO ARMADO 0.68x0.68x0.08</w:t>
             </w:r>
           </w:p>
         </w:tc>
@@ -16487,7 +16487,7 @@
                 <w:i w:val="0"/>
                 <w:sz w:val="17"/>
               </w:rPr>
-              <w:t>A2</w:t>
+              <w:t>A1</w:t>
             </w:r>
           </w:p>
         </w:tc>
@@ -16529,7 +16529,7 @@
                 <w:i w:val="0"/>
                 <w:sz w:val="17"/>
               </w:rPr>
-              <w:t>DPL-22</w:t>
+              <w:t>DPL-25</w:t>
             </w:r>
           </w:p>
         </w:tc>
@@ -16549,7 +16549,7 @@
                 <w:i w:val="0"/>
                 <w:sz w:val="17"/>
               </w:rPr>
-              <w:t>DETALLE MONTANTE - EDIF08</w:t>
+              <w:t>EMPALME DE CUNETAS A COLECTOR</w:t>
             </w:r>
           </w:p>
         </w:tc>
@@ -16611,7 +16611,7 @@
                 <w:i w:val="0"/>
                 <w:sz w:val="17"/>
               </w:rPr>
-              <w:t>DPL-23</w:t>
+              <w:t>DPL-26</w:t>
             </w:r>
           </w:p>
         </w:tc>
@@ -16631,7 +16631,7 @@
                 <w:i w:val="0"/>
                 <w:sz w:val="17"/>
               </w:rPr>
-              <w:t>DETALLE MONTANTE - EDIF09</w:t>
+              <w:t>CAJA DE LLEGADA (0+000) Y CAJA DE CAÍDA CON POZA DE DISIPACIÓN (ENTREGA AL CAR MUJERES)</w:t>
             </w:r>
           </w:p>
         </w:tc>
@@ -16651,7 +16651,7 @@
                 <w:i w:val="0"/>
                 <w:sz w:val="17"/>
               </w:rPr>
-              <w:t>A2</w:t>
+              <w:t>A1</w:t>
             </w:r>
           </w:p>
         </w:tc>
@@ -16693,7 +16693,7 @@
                 <w:i w:val="0"/>
                 <w:sz w:val="17"/>
               </w:rPr>
-              <w:t>DPL-25</w:t>
+              <w:t>DPL-27</w:t>
             </w:r>
           </w:p>
         </w:tc>
@@ -16713,7 +16713,7 @@
                 <w:i w:val="0"/>
                 <w:sz w:val="17"/>
               </w:rPr>
-              <w:t>EMPALME DE CUNETAS A COLECTOR</w:t>
+              <w:t>ISOMÉTRICOS CONSTRUCTIVOS</w:t>
             </w:r>
           </w:p>
         </w:tc>
@@ -16775,7 +16775,7 @@
                 <w:i w:val="0"/>
                 <w:sz w:val="17"/>
               </w:rPr>
-              <w:t>DPL-27</w:t>
+              <w:t>DPL-28</w:t>
             </w:r>
           </w:p>
         </w:tc>
@@ -16795,7 +16795,7 @@
                 <w:i w:val="0"/>
                 <w:sz w:val="17"/>
               </w:rPr>
-              <w:t>ISOMÉTRICOS CONSTRUCTIVOS</w:t>
+              <w:t>DETALLE CONSTRUCTIVO: JUNTAS E=1" CON TECNOPOR Y SELLADOR ASFÁLTICO (COLECTOR Y CERCO)</w:t>
             </w:r>
           </w:p>
         </w:tc>
@@ -16857,7 +16857,7 @@
                 <w:i w:val="0"/>
                 <w:sz w:val="17"/>
               </w:rPr>
-              <w:t>DPL-28</w:t>
+              <w:t>DPL-29</w:t>
             </w:r>
           </w:p>
         </w:tc>
@@ -16877,7 +16877,7 @@
                 <w:i w:val="0"/>
                 <w:sz w:val="17"/>
               </w:rPr>
-              <w:t>DETALLE CONSTRUCTIVO: JUNTAS E=1" CON TECNOPOR Y SELLADOR ASFÁLTICO (COLECTOR Y CERCO)</w:t>
+              <w:t>REGISTRO DE LIMPIEZA CON TAPA CIEGA DE CONCRETO ARMADO 0.68x0.68x0.08 - COMPONENTES</w:t>
             </w:r>
           </w:p>
         </w:tc>
@@ -16939,7 +16939,7 @@
                 <w:i w:val="0"/>
                 <w:sz w:val="17"/>
               </w:rPr>
-              <w:t>DPL-29</w:t>
+              <w:t>DPL-30</w:t>
             </w:r>
           </w:p>
         </w:tc>
@@ -16959,7 +16959,7 @@
                 <w:i w:val="0"/>
                 <w:sz w:val="17"/>
               </w:rPr>
-              <w:t>REGISTRO DE LIMPIEZA CON TAPA CIEGA DE CONCRETO ARMADO 0.68x0.68x0.08 - COMPONENTES</w:t>
+              <w:t>DETALLES DE CANALETA DE TECHO, SOPORTE Y ACCESORIOS</w:t>
             </w:r>
           </w:p>
         </w:tc>
@@ -17021,7 +17021,7 @@
                 <w:i w:val="0"/>
                 <w:sz w:val="17"/>
               </w:rPr>
-              <w:t>DPL-30</w:t>
+              <w:t>DPL-31</w:t>
             </w:r>
           </w:p>
         </w:tc>
@@ -17041,7 +17041,7 @@
                 <w:i w:val="0"/>
                 <w:sz w:val="17"/>
               </w:rPr>
-              <w:t>DETALLES DE CANALETA DE TECHO, SOPORTE Y ACCESORIOS</w:t>
+              <w:t>ISOMÉTRICO DE CANALETA, SOPORTES, PERNOS, TAPA Y BOQUILLA</w:t>
             </w:r>
           </w:p>
         </w:tc>
@@ -17061,7 +17061,7 @@
                 <w:i w:val="0"/>
                 <w:sz w:val="17"/>
               </w:rPr>
-              <w:t>A2</w:t>
+              <w:t>A3</w:t>
             </w:r>
           </w:p>
         </w:tc>
@@ -17103,7 +17103,7 @@
                 <w:i w:val="0"/>
                 <w:sz w:val="17"/>
               </w:rPr>
-              <w:t>DPL-33</w:t>
+              <w:t>DPL-32</w:t>
             </w:r>
           </w:p>
         </w:tc>
@@ -17123,7 +17123,7 @@
                 <w:i w:val="0"/>
                 <w:sz w:val="17"/>
               </w:rPr>
-              <w:t>ELEVACIÓN DE CANALETA Y CORTE DEL MONTANTE PLUVIAL</w:t>
+              <w:t>DETALLES 3D DE LOS ELEMENTOS DEL MONTANTE</w:t>
             </w:r>
           </w:p>
         </w:tc>
@@ -17143,7 +17143,7 @@
                 <w:i w:val="0"/>
                 <w:sz w:val="17"/>
               </w:rPr>
-              <w:t>A2</w:t>
+              <w:t>A3</w:t>
             </w:r>
           </w:p>
         </w:tc>
@@ -17185,7 +17185,7 @@
                 <w:i w:val="0"/>
                 <w:sz w:val="17"/>
               </w:rPr>
-              <w:t>DPL-34</w:t>
+              <w:t>DPL-33</w:t>
             </w:r>
           </w:p>
         </w:tc>
@@ -17205,7 +17205,7 @@
                 <w:i w:val="0"/>
                 <w:sz w:val="17"/>
               </w:rPr>
-              <w:t>ISOMÉTRICO DEL MONTANTE PLUVIAL TÍPICO</w:t>
+              <w:t>ELEVACIÓN DE CANALETA Y CORTE DEL MONTANTE PLUVIAL</w:t>
             </w:r>
           </w:p>
         </w:tc>
@@ -17267,7 +17267,7 @@
                 <w:i w:val="0"/>
                 <w:sz w:val="17"/>
               </w:rPr>
-              <w:t>DPL-37</w:t>
+              <w:t>DPL-34</w:t>
             </w:r>
           </w:p>
         </w:tc>
@@ -17287,7 +17287,7 @@
                 <w:i w:val="0"/>
                 <w:sz w:val="17"/>
               </w:rPr>
-              <w:t>DETALLE DE LLORADERO: CORTE, TUBO PERFORADO Y DESAGREGADO</w:t>
+              <w:t>ISOMÉTRICO DEL MONTANTE PLUVIAL TÍPICO</w:t>
             </w:r>
           </w:p>
         </w:tc>
@@ -17349,7 +17349,7 @@
                 <w:i w:val="0"/>
                 <w:sz w:val="17"/>
               </w:rPr>
-              <w:t>DPL-14</w:t>
+              <w:t>DPL-35</w:t>
             </w:r>
           </w:p>
         </w:tc>
@@ -17369,7 +17369,7 @@
                 <w:i w:val="0"/>
                 <w:sz w:val="17"/>
               </w:rPr>
-              <w:t>ISOMÉTRICOS DE LAS SECCIONES TRANSVERSALES</w:t>
+              <w:t>ISOMÉTRICO DE LA CAJA SUMIDERO DE PISO</w:t>
             </w:r>
           </w:p>
         </w:tc>
@@ -17431,7 +17431,7 @@
                 <w:i w:val="0"/>
                 <w:sz w:val="17"/>
               </w:rPr>
-              <w:t>DPL-31</w:t>
+              <w:t>DPL-36</w:t>
             </w:r>
           </w:p>
         </w:tc>
@@ -17451,7 +17451,7 @@
                 <w:i w:val="0"/>
                 <w:sz w:val="17"/>
               </w:rPr>
-              <w:t>ISOMÉTRICO DE CANALETA, SOPORTES, PERNOS, TAPA Y BOQUILLA</w:t>
+              <w:t>DETALLE DE CAJA SUMIDERO DE PISO: CORTE, PLANTA Y DESAGREGADO</w:t>
             </w:r>
           </w:p>
         </w:tc>
@@ -17513,7 +17513,7 @@
                 <w:i w:val="0"/>
                 <w:sz w:val="17"/>
               </w:rPr>
-              <w:t>DPL-32</w:t>
+              <w:t>DPL-37</w:t>
             </w:r>
           </w:p>
         </w:tc>
@@ -17533,7 +17533,7 @@
                 <w:i w:val="0"/>
                 <w:sz w:val="17"/>
               </w:rPr>
-              <w:t>DETALLES 3D DE LOS ELEMENTOS DEL MONTANTE</w:t>
+              <w:t>ISOMÉTRICO DE INSTALACIÓN DE LLORADEROS EN CUNETAS</w:t>
             </w:r>
           </w:p>
         </w:tc>
@@ -17553,7 +17553,7 @@
                 <w:i w:val="0"/>
                 <w:sz w:val="17"/>
               </w:rPr>
-              <w:t>A3</w:t>
+              <w:t>A1</w:t>
             </w:r>
           </w:p>
         </w:tc>
@@ -17595,7 +17595,7 @@
                 <w:i w:val="0"/>
                 <w:sz w:val="17"/>
               </w:rPr>
-              <w:t>DPL-35</w:t>
+              <w:t>DPL-38</w:t>
             </w:r>
           </w:p>
         </w:tc>
@@ -17615,7 +17615,7 @@
                 <w:i w:val="0"/>
                 <w:sz w:val="17"/>
               </w:rPr>
-              <w:t>ISOMÉTRICO DE LA CAJA SUMIDERO DE PISO</w:t>
+              <w:t>DETALLE DE LLORADERO: CORTE, TUBO PERFORADO Y DESAGREGADO</w:t>
             </w:r>
           </w:p>
         </w:tc>
@@ -17635,7 +17635,7 @@
                 <w:i w:val="0"/>
                 <w:sz w:val="17"/>
               </w:rPr>
-              <w:t>A3</w:t>
+              <w:t>A2</w:t>
             </w:r>
           </w:p>
         </w:tc>
@@ -17677,7 +17677,7 @@
                 <w:i w:val="0"/>
                 <w:sz w:val="17"/>
               </w:rPr>
-              <w:t>DPL-36</w:t>
+              <w:t>DPL-39</w:t>
             </w:r>
           </w:p>
         </w:tc>
@@ -17697,7 +17697,7 @@
                 <w:i w:val="0"/>
                 <w:sz w:val="17"/>
               </w:rPr>
-              <w:t>DETALLE DE CAJA SUMIDERO DE PISO: CORTE, PLANTA Y DESAGREGADO</w:t>
+              <w:t>DETALLE CONSTRUCTIVO FALSA COLUMNA PARA MONTANTE PLUVIAL EN EDIFICACIONES</w:t>
             </w:r>
           </w:p>
         </w:tc>
@@ -17759,7 +17759,7 @@
                 <w:i w:val="0"/>
                 <w:sz w:val="17"/>
               </w:rPr>
-              <w:t>DPL-38</w:t>
+              <w:t>DPL-40</w:t>
             </w:r>
           </w:p>
         </w:tc>
@@ -17779,7 +17779,7 @@
                 <w:i w:val="0"/>
                 <w:sz w:val="17"/>
               </w:rPr>
-              <w:t>DETALLE CONSTRUCTIVO FALSA COLUMNA PARA MONTANTE PLUVIAL EN EDIFICACIONES</w:t>
+              <w:t>PLANTA DE UBICACIÓN DE LLORADEROS EN CUNETAS COLINDANTES CON ÁREA VERDE</w:t>
             </w:r>
           </w:p>
         </w:tc>
@@ -17799,7 +17799,171 @@
                 <w:i w:val="0"/>
                 <w:sz w:val="17"/>
               </w:rPr>
-              <w:t>A3</w:t>
+              <w:t>A0</w:t>
+            </w:r>
+          </w:p>
+        </w:tc>
+      </w:tr>
+      <w:tr>
+        <w:tc>
+          <w:tcPr>
+            <w:tcW w:type="dxa" w:w="567"/>
+            <w:vAlign w:val="center"/>
+          </w:tcPr>
+          <w:p>
+            <w:pPr>
+              <w:spacing w:after="20" w:before="20"/>
+              <w:jc w:val="center"/>
+            </w:pPr>
+            <w:r>
+              <w:rPr>
+                <w:b w:val="0"/>
+                <w:i w:val="0"/>
+                <w:sz w:val="17"/>
+              </w:rPr>
+              <w:t>41</w:t>
+            </w:r>
+          </w:p>
+        </w:tc>
+        <w:tc>
+          <w:tcPr>
+            <w:tcW w:type="dxa" w:w="1020"/>
+            <w:vAlign w:val="center"/>
+          </w:tcPr>
+          <w:p>
+            <w:pPr>
+              <w:spacing w:after="20" w:before="20"/>
+              <w:jc w:val="center"/>
+            </w:pPr>
+            <w:r>
+              <w:rPr>
+                <w:b w:val="0"/>
+                <w:i w:val="0"/>
+                <w:sz w:val="17"/>
+              </w:rPr>
+              <w:t>DPL-41</w:t>
+            </w:r>
+          </w:p>
+        </w:tc>
+        <w:tc>
+          <w:tcPr>
+            <w:tcW w:type="dxa" w:w="6463"/>
+            <w:vAlign w:val="center"/>
+          </w:tcPr>
+          <w:p>
+            <w:pPr>
+              <w:spacing w:after="20" w:before="20"/>
+              <w:jc w:val="left"/>
+            </w:pPr>
+            <w:r>
+              <w:rPr>
+                <w:b w:val="0"/>
+                <w:i w:val="0"/>
+                <w:sz w:val="17"/>
+              </w:rPr>
+              <w:t>ISOMÉTRICO DEL DRENAJE PLUVIAL DE LA OC-01 (JARDINERA + BANCA + PÉRGOLA)</w:t>
+            </w:r>
+          </w:p>
+        </w:tc>
+        <w:tc>
+          <w:tcPr>
+            <w:tcW w:type="dxa" w:w="1020"/>
+            <w:vAlign w:val="center"/>
+          </w:tcPr>
+          <w:p>
+            <w:pPr>
+              <w:spacing w:after="20" w:before="20"/>
+              <w:jc w:val="center"/>
+            </w:pPr>
+            <w:r>
+              <w:rPr>
+                <w:b w:val="0"/>
+                <w:i w:val="0"/>
+                <w:sz w:val="17"/>
+              </w:rPr>
+              <w:t>A2</w:t>
+            </w:r>
+          </w:p>
+        </w:tc>
+      </w:tr>
+      <w:tr>
+        <w:tc>
+          <w:tcPr>
+            <w:tcW w:type="dxa" w:w="567"/>
+            <w:vAlign w:val="center"/>
+          </w:tcPr>
+          <w:p>
+            <w:pPr>
+              <w:spacing w:after="20" w:before="20"/>
+              <w:jc w:val="center"/>
+            </w:pPr>
+            <w:r>
+              <w:rPr>
+                <w:b w:val="0"/>
+                <w:i w:val="0"/>
+                <w:sz w:val="17"/>
+              </w:rPr>
+              <w:t>42</w:t>
+            </w:r>
+          </w:p>
+        </w:tc>
+        <w:tc>
+          <w:tcPr>
+            <w:tcW w:type="dxa" w:w="1020"/>
+            <w:vAlign w:val="center"/>
+          </w:tcPr>
+          <w:p>
+            <w:pPr>
+              <w:spacing w:after="20" w:before="20"/>
+              <w:jc w:val="center"/>
+            </w:pPr>
+            <w:r>
+              <w:rPr>
+                <w:b w:val="0"/>
+                <w:i w:val="0"/>
+                <w:sz w:val="17"/>
+              </w:rPr>
+              <w:t>DPL-42</w:t>
+            </w:r>
+          </w:p>
+        </w:tc>
+        <w:tc>
+          <w:tcPr>
+            <w:tcW w:type="dxa" w:w="6463"/>
+            <w:vAlign w:val="center"/>
+          </w:tcPr>
+          <w:p>
+            <w:pPr>
+              <w:spacing w:after="20" w:before="20"/>
+              <w:jc w:val="left"/>
+            </w:pPr>
+            <w:r>
+              <w:rPr>
+                <w:b w:val="0"/>
+                <w:i w:val="0"/>
+                <w:sz w:val="17"/>
+              </w:rPr>
+              <w:t>DETALLE ISOMÉTRICO DE LA SALIDA DE LA CANALETA DE LA OC-01</w:t>
+            </w:r>
+          </w:p>
+        </w:tc>
+        <w:tc>
+          <w:tcPr>
+            <w:tcW w:type="dxa" w:w="1020"/>
+            <w:vAlign w:val="center"/>
+          </w:tcPr>
+          <w:p>
+            <w:pPr>
+              <w:spacing w:after="20" w:before="20"/>
+              <w:jc w:val="center"/>
+            </w:pPr>
+            <w:r>
+              <w:rPr>
+                <w:b w:val="0"/>
+                <w:i w:val="0"/>
+                <w:sz w:val="17"/>
+              </w:rPr>
+              <w:t>A2</w:t>
             </w:r>
           </w:p>
         </w:tc>
@@ -17817,21 +17981,7 @@
           <w:color w:val="595959"/>
           <w:sz w:val="18"/>
         </w:rPr>
-        <w:t>Fuente: Índice de planos de drenaje pluvial (orden del juego de láminas, por formato de hoja).</w:t>
-      </w:r>
-    </w:p>
-    <w:p>
-      <w:pPr>
-        <w:spacing w:before="0" w:after="120" w:line="276" w:lineRule="auto"/>
-        <w:jc w:val="both"/>
-      </w:pPr>
-      <w:r>
-        <w:rPr>
-          <w:b w:val="0"/>
-          <w:i w:val="0"/>
-          <w:sz w:val="20"/>
-        </w:rPr>
-        <w:t>Las bancas con pérgola OC-01 se detallan además en las láminas DPL-41 (isométrico del drenaje pluvial y planta de techos) y DPL-42 (detalle isométrico de la salida de la canaleta), entregadas en DXF.</w:t>
+        <w:t>Fuente: Índice de planos de drenaje pluvial (láminas DPL-01 a DPL-42).</w:t>
       </w:r>
     </w:p>
     <w:sectPr>

</xml_diff>